<commit_message>
Referências: adiciona Pickett & Wilkinson (2015) e de Mello & Schneider
Completa as duas citações que estavam no corpo mas faltavam na lista.
- Pickett & Wilkinson (2015), 'Income inequality and health: a causal
  review', Social Science & Medicine 128:316-326 (verificado).
- 'EconomiA (2010)' de de Mello & Schneider NÃO se confirmou; usei o paper
  real desses autores ('Mudança demográfica e a dinâmica dos homicídios no
  Estado de São Paulo', São Paulo em Perspectiva, 21(1):19-30, 2007) e
  ajustei a frase no corpo para refletir o que esse paper de fato mostra
  (dinâmica demográfica), mantendo a tese de desigualdade do parágrafo.
</commit_message>
<xml_diff>
--- a/paper/recuperacoes.docx
+++ b/paper/recuperacoes.docx
@@ -84,7 +84,7 @@
         <w:pStyle w:val="Date"/>
       </w:pPr>
       <w:r>
-        <w:t xml:space="preserve">2026-06-26</w:t>
+        <w:t xml:space="preserve">2026-06-27</w:t>
       </w:r>
     </w:p>
     <w:p>
@@ -1083,43 +1083,47 @@
         <w:t xml:space="preserve"> </w:t>
       </w:r>
       <w:r>
-        <w:t xml:space="preserve">concentração espacial em áreas periféricas e favelas. Um estudo empírico de João Manoel Pinho de</w:t>
-      </w:r>
-      <w:r>
-        <w:t xml:space="preserve"> </w:t>
-      </w:r>
-      <w:r>
-        <w:t xml:space="preserve">Mello e Alexandre Schneider, publicado na revista EconomiA (2010), mostra que a desigualdade</w:t>
-      </w:r>
-      <w:r>
-        <w:t xml:space="preserve"> </w:t>
-      </w:r>
-      <w:r>
-        <w:t xml:space="preserve">intraurbana — medida pela variação de renda entre bairros — está positivamente associada às</w:t>
-      </w:r>
-      <w:r>
-        <w:t xml:space="preserve"> </w:t>
-      </w:r>
-      <w:r>
-        <w:t xml:space="preserve">taxas de homicídio no município, mesmo controlando por fatores como escolaridade e densidade</w:t>
-      </w:r>
-      <w:r>
-        <w:t xml:space="preserve"> </w:t>
-      </w:r>
-      <w:r>
-        <w:t xml:space="preserve">populacional. Os autores encontram evidências de que áreas com maior disparidade socioeconômica</w:t>
-      </w:r>
-      <w:r>
-        <w:t xml:space="preserve"> </w:t>
-      </w:r>
-      <w:r>
-        <w:t xml:space="preserve">apresentam níveis significativamente mais elevados de violência letal, reforçando a hipótese de que</w:t>
-      </w:r>
-      <w:r>
-        <w:t xml:space="preserve"> </w:t>
-      </w:r>
-      <w:r>
-        <w:t xml:space="preserve">a segregação espacial amplifica os efeitos da desigualdade sobre o crime.</w:t>
+        <w:t xml:space="preserve">concentração espacial em áreas periféricas e favelas. Estudos sobre o estado de São Paulo, como o</w:t>
+      </w:r>
+      <w:r>
+        <w:t xml:space="preserve"> </w:t>
+      </w:r>
+      <w:r>
+        <w:t xml:space="preserve">de João Manoel Pinho de Mello e Alexandre Schneider (</w:t>
+      </w:r>
+      <w:r>
+        <w:rPr>
+          <w:i/>
+          <w:iCs/>
+        </w:rPr>
+        <w:t xml:space="preserve">São Paulo em Perspectiva</w:t>
+      </w:r>
+      <w:r>
+        <w:t xml:space="preserve">, 2007),</w:t>
+      </w:r>
+      <w:r>
+        <w:t xml:space="preserve"> </w:t>
+      </w:r>
+      <w:r>
+        <w:t xml:space="preserve">evidenciam ainda o peso da dinâmica demográfica — sobretudo da parcela de jovens do sexo</w:t>
+      </w:r>
+      <w:r>
+        <w:t xml:space="preserve"> </w:t>
+      </w:r>
+      <w:r>
+        <w:t xml:space="preserve">masculino — sobre a evolução dos homicídios. Em conjunto, desigualdade intraurbana, segregação</w:t>
+      </w:r>
+      <w:r>
+        <w:t xml:space="preserve"> </w:t>
+      </w:r>
+      <w:r>
+        <w:t xml:space="preserve">espacial e estrutura etária ajudam a explicar por que a violência letal se concentra nas áreas de</w:t>
+      </w:r>
+      <w:r>
+        <w:t xml:space="preserve"> </w:t>
+      </w:r>
+      <w:r>
+        <w:t xml:space="preserve">maior disparidade socioeconômica.</w:t>
       </w:r>
     </w:p>
     <w:p>
@@ -5572,6 +5576,36 @@
         <w:pStyle w:val="BodyText"/>
       </w:pPr>
       <w:r>
+        <w:t xml:space="preserve">DE MELLO, João Manoel Pinho de; SCHNEIDER, Alexandre (2007).</w:t>
+      </w:r>
+      <w:r>
+        <w:t xml:space="preserve"> </w:t>
+      </w:r>
+      <w:r>
+        <w:t xml:space="preserve">“Mudança demográfica e a dinâmica dos homicídios no Estado de São Paulo”</w:t>
+      </w:r>
+      <w:r>
+        <w:t xml:space="preserve">.</w:t>
+      </w:r>
+      <w:r>
+        <w:t xml:space="preserve"> </w:t>
+      </w:r>
+      <w:r>
+        <w:rPr>
+          <w:i/>
+          <w:iCs/>
+        </w:rPr>
+        <w:t xml:space="preserve">São Paulo em Perspectiva</w:t>
+      </w:r>
+      <w:r>
+        <w:t xml:space="preserve">, v. 21, n. 1, p. 19–30.</w:t>
+      </w:r>
+    </w:p>
+    <w:p>
+      <w:pPr>
+        <w:pStyle w:val="BodyText"/>
+      </w:pPr>
+      <w:r>
         <w:t xml:space="preserve">DE NADAI, Marco</w:t>
       </w:r>
       <w:r>
@@ -5695,6 +5729,36 @@
       </w:r>
       <w:r>
         <w:t xml:space="preserve">. Washington, DC: Inter-American Development Bank.</w:t>
+      </w:r>
+    </w:p>
+    <w:p>
+      <w:pPr>
+        <w:pStyle w:val="BodyText"/>
+      </w:pPr>
+      <w:r>
+        <w:t xml:space="preserve">PICKETT, Kate E.; WILKINSON, Richard G. (2015).</w:t>
+      </w:r>
+      <w:r>
+        <w:t xml:space="preserve"> </w:t>
+      </w:r>
+      <w:r>
+        <w:t xml:space="preserve">“Income inequality and health: a causal review”</w:t>
+      </w:r>
+      <w:r>
+        <w:t xml:space="preserve">.</w:t>
+      </w:r>
+      <w:r>
+        <w:t xml:space="preserve"> </w:t>
+      </w:r>
+      <w:r>
+        <w:rPr>
+          <w:i/>
+          <w:iCs/>
+        </w:rPr>
+        <w:t xml:space="preserve">Social Science &amp; Medicine</w:t>
+      </w:r>
+      <w:r>
+        <w:t xml:space="preserve">, v. 128, p. 316–326.</w:t>
       </w:r>
     </w:p>
     <w:p>

</xml_diff>

<commit_message>
Referências: funde 'Fontes de dados' na seção Referências (lista única)
- Uma única seção Referências, alfabética, com a literatura acadêmica e as
  fontes de dados (FBSP, StatCounter, CETIC, FIPE/Trocafy, OLX, ouro,
  joalherias, SEGUR, SHAW, IBGE, Euromonitor, etc.) no mesmo formato
  bibliográfico do outro estudo.
- Removidas as menções ao inventário (inventario_fontes.md / dados_distribuicao.json)
  no corpo e nas fontes.
</commit_message>
<xml_diff>
--- a/paper/recuperacoes.docx
+++ b/paper/recuperacoes.docx
@@ -4009,7 +4009,7 @@
         <w:t xml:space="preserve"> </w:t>
       </w:r>
       <w:r>
-        <w:t xml:space="preserve">— folheado de R$ 15 a R$ 250 e cordões de ouro 18k de R$ 280 a R$ 3.000, à</w:t>
+        <w:t xml:space="preserve">vão do folheado (R$ 15 a R$ 250) ao cordão de ouro 18k (R$ 280 a R$ 3.000, à</w:t>
       </w:r>
       <w:r>
         <w:t xml:space="preserve"> </w:t>
@@ -4029,7 +4029,7 @@
         </m:r>
       </m:oMath>
       <w:r>
-        <w:t xml:space="preserve">R$ 530/g — estão documentadas no inventário de fontes.</w:t>
+        <w:t xml:space="preserve">R$ 530/g).</w:t>
       </w:r>
     </w:p>
     <w:bookmarkEnd w:id="27"/>
@@ -5576,16 +5576,7 @@
         <w:pStyle w:val="BodyText"/>
       </w:pPr>
       <w:r>
-        <w:t xml:space="preserve">DE MELLO, João Manoel Pinho de; SCHNEIDER, Alexandre (2007).</w:t>
-      </w:r>
-      <w:r>
-        <w:t xml:space="preserve"> </w:t>
-      </w:r>
-      <w:r>
-        <w:t xml:space="preserve">“Mudança demográfica e a dinâmica dos homicídios no Estado de São Paulo”</w:t>
-      </w:r>
-      <w:r>
-        <w:t xml:space="preserve">.</w:t>
+        <w:t xml:space="preserve">CETIC.BR (2024).</w:t>
       </w:r>
       <w:r>
         <w:t xml:space="preserve"> </w:t>
@@ -5595,10 +5586,10 @@
           <w:i/>
           <w:iCs/>
         </w:rPr>
-        <w:t xml:space="preserve">São Paulo em Perspectiva</w:t>
-      </w:r>
-      <w:r>
-        <w:t xml:space="preserve">, v. 21, n. 1, p. 19–30.</w:t>
+        <w:t xml:space="preserve">TIC Domicílios</w:t>
+      </w:r>
+      <w:r>
+        <w:t xml:space="preserve">. São Paulo: Comitê Gestor da Internet no Brasil.</w:t>
       </w:r>
     </w:p>
     <w:p>
@@ -5606,7 +5597,16 @@
         <w:pStyle w:val="BodyText"/>
       </w:pPr>
       <w:r>
-        <w:t xml:space="preserve">DE NADAI, Marco</w:t>
+        <w:t xml:space="preserve">DE MELLO, João Manoel Pinho de; SCHNEIDER, Alexandre (2007).</w:t>
+      </w:r>
+      <w:r>
+        <w:t xml:space="preserve"> </w:t>
+      </w:r>
+      <w:r>
+        <w:t xml:space="preserve">“Mudança demográfica e a dinâmica dos homicídios no Estado de São Paulo”</w:t>
+      </w:r>
+      <w:r>
+        <w:t xml:space="preserve">.</w:t>
       </w:r>
       <w:r>
         <w:t xml:space="preserve"> </w:t>
@@ -5616,13 +5616,18 @@
           <w:i/>
           <w:iCs/>
         </w:rPr>
-        <w:t xml:space="preserve">et al.</w:t>
-      </w:r>
-      <w:r>
-        <w:t xml:space="preserve"> </w:t>
-      </w:r>
-      <w:r>
-        <w:t xml:space="preserve">(2020).</w:t>
+        <w:t xml:space="preserve">São Paulo em Perspectiva</w:t>
+      </w:r>
+      <w:r>
+        <w:t xml:space="preserve">, v. 21, n. 1, p. 19–30.</w:t>
+      </w:r>
+    </w:p>
+    <w:p>
+      <w:pPr>
+        <w:pStyle w:val="BodyText"/>
+      </w:pPr>
+      <w:r>
+        <w:t xml:space="preserve">DE NADAI, Marco</w:t>
       </w:r>
       <w:r>
         <w:t xml:space="preserve"> </w:t>
@@ -5632,27 +5637,13 @@
           <w:i/>
           <w:iCs/>
         </w:rPr>
-        <w:t xml:space="preserve">Socio-economic and urban factors of crime</w:t>
-      </w:r>
-      <w:r>
-        <w:t xml:space="preserve">. arXiv preprint.</w:t>
-      </w:r>
-    </w:p>
-    <w:p>
-      <w:pPr>
-        <w:pStyle w:val="BodyText"/>
-      </w:pPr>
-      <w:r>
-        <w:t xml:space="preserve">FAJNZYLBER, Pablo; LEDERMAN, Daniel; LOAYZA, Norman (2002).</w:t>
-      </w:r>
-      <w:r>
-        <w:t xml:space="preserve"> </w:t>
-      </w:r>
-      <w:r>
-        <w:t xml:space="preserve">“Inequality and violent crime”</w:t>
-      </w:r>
-      <w:r>
-        <w:t xml:space="preserve">.</w:t>
+        <w:t xml:space="preserve">et al.</w:t>
+      </w:r>
+      <w:r>
+        <w:t xml:space="preserve"> </w:t>
+      </w:r>
+      <w:r>
+        <w:t xml:space="preserve">(2020).</w:t>
       </w:r>
       <w:r>
         <w:t xml:space="preserve"> </w:t>
@@ -5662,10 +5653,10 @@
           <w:i/>
           <w:iCs/>
         </w:rPr>
-        <w:t xml:space="preserve">Journal of Law and Economics</w:t>
-      </w:r>
-      <w:r>
-        <w:t xml:space="preserve">, Chicago, v. 45, n. 1, p. 1–40. DOI: 10.1086/338347.</w:t>
+        <w:t xml:space="preserve">Socio-economic and urban factors of crime</w:t>
+      </w:r>
+      <w:r>
+        <w:t xml:space="preserve">. arXiv preprint.</w:t>
       </w:r>
     </w:p>
     <w:p>
@@ -5673,28 +5664,20 @@
         <w:pStyle w:val="BodyText"/>
       </w:pPr>
       <w:r>
-        <w:t xml:space="preserve">FÓRUM BRASILEIRO DE SEGURANÇA PÚBLICA (2019).</w:t>
-      </w:r>
-      <w:r>
-        <w:t xml:space="preserve"> </w:t>
+        <w:t xml:space="preserve">ETULAIN, C. </w:t>
       </w:r>
       <w:r>
         <w:rPr>
           <w:i/>
           <w:iCs/>
         </w:rPr>
-        <w:t xml:space="preserve">Anuário brasileiro de segurança pública 2019</w:t>
-      </w:r>
-      <w:r>
-        <w:t xml:space="preserve">. São Paulo: FBSP.</w:t>
-      </w:r>
-    </w:p>
-    <w:p>
-      <w:pPr>
-        <w:pStyle w:val="BodyText"/>
-      </w:pPr>
-      <w:r>
-        <w:t xml:space="preserve">INSTITUTO DE PESQUISA ECONÔMICA APLICADA (IPEA); FÓRUM BRASILEIRO DE SEGURANÇA PÚBLICA.</w:t>
+        <w:t xml:space="preserve">et al.</w:t>
+      </w:r>
+      <w:r>
+        <w:t xml:space="preserve"> </w:t>
+      </w:r>
+      <w:r>
+        <w:t xml:space="preserve">(2021).</w:t>
       </w:r>
       <w:r>
         <w:t xml:space="preserve"> </w:t>
@@ -5704,10 +5687,10 @@
           <w:i/>
           <w:iCs/>
         </w:rPr>
-        <w:t xml:space="preserve">Atlas da violência</w:t>
-      </w:r>
-      <w:r>
-        <w:t xml:space="preserve">. Brasília: IPEA; FBSP, várias edições.</w:t>
+        <w:t xml:space="preserve">Produção de semijoias em Limeira</w:t>
+      </w:r>
+      <w:r>
+        <w:t xml:space="preserve">. Campinas: UNICAMP; IBGM.</w:t>
       </w:r>
     </w:p>
     <w:p>
@@ -5715,7 +5698,7 @@
         <w:pStyle w:val="BodyText"/>
       </w:pPr>
       <w:r>
-        <w:t xml:space="preserve">JAITMAN, Laura (ed.) (2017).</w:t>
+        <w:t xml:space="preserve">EUROMONITOR INTERNATIONAL (2025).</w:t>
       </w:r>
       <w:r>
         <w:t xml:space="preserve"> </w:t>
@@ -5725,10 +5708,10 @@
           <w:i/>
           <w:iCs/>
         </w:rPr>
-        <w:t xml:space="preserve">The costs of crime and violence: new evidence and insights in Latin America and the Caribbean</w:t>
-      </w:r>
-      <w:r>
-        <w:t xml:space="preserve">. Washington, DC: Inter-American Development Bank.</w:t>
+        <w:t xml:space="preserve">Jewellery in Brazil</w:t>
+      </w:r>
+      <w:r>
+        <w:t xml:space="preserve">. London: Euromonitor.</w:t>
       </w:r>
     </w:p>
     <w:p>
@@ -5736,13 +5719,13 @@
         <w:pStyle w:val="BodyText"/>
       </w:pPr>
       <w:r>
-        <w:t xml:space="preserve">PICKETT, Kate E.; WILKINSON, Richard G. (2015).</w:t>
-      </w:r>
-      <w:r>
-        <w:t xml:space="preserve"> </w:t>
-      </w:r>
-      <w:r>
-        <w:t xml:space="preserve">“Income inequality and health: a causal review”</w:t>
+        <w:t xml:space="preserve">FAJNZYLBER, Pablo; LEDERMAN, Daniel; LOAYZA, Norman (2002).</w:t>
+      </w:r>
+      <w:r>
+        <w:t xml:space="preserve"> </w:t>
+      </w:r>
+      <w:r>
+        <w:t xml:space="preserve">“Inequality and violent crime”</w:t>
       </w:r>
       <w:r>
         <w:t xml:space="preserve">.</w:t>
@@ -5755,10 +5738,10 @@
           <w:i/>
           <w:iCs/>
         </w:rPr>
-        <w:t xml:space="preserve">Social Science &amp; Medicine</w:t>
-      </w:r>
-      <w:r>
-        <w:t xml:space="preserve">, v. 128, p. 316–326.</w:t>
+        <w:t xml:space="preserve">Journal of Law and Economics</w:t>
+      </w:r>
+      <w:r>
+        <w:t xml:space="preserve">, Chicago, v. 45, n. 1, p. 1–40. DOI: 10.1086/338347.</w:t>
       </w:r>
     </w:p>
     <w:p>
@@ -5766,16 +5749,7 @@
         <w:pStyle w:val="BodyText"/>
       </w:pPr>
       <w:r>
-        <w:t xml:space="preserve">RESENDE, João Paulo de (2011).</w:t>
-      </w:r>
-      <w:r>
-        <w:t xml:space="preserve"> </w:t>
-      </w:r>
-      <w:r>
-        <w:t xml:space="preserve">“Desigualdade de renda e criminalidade”</w:t>
-      </w:r>
-      <w:r>
-        <w:t xml:space="preserve">.</w:t>
+        <w:t xml:space="preserve">FÓRUM BRASILEIRO DE SEGURANÇA PÚBLICA (2019).</w:t>
       </w:r>
       <w:r>
         <w:t xml:space="preserve"> </w:t>
@@ -5785,10 +5759,10 @@
           <w:i/>
           <w:iCs/>
         </w:rPr>
-        <w:t xml:space="preserve">Estudos Econômicos</w:t>
-      </w:r>
-      <w:r>
-        <w:t xml:space="preserve">, São Paulo, v. 41, n. 4, p. 731–753.</w:t>
+        <w:t xml:space="preserve">Anuário brasileiro de segurança pública 2019</w:t>
+      </w:r>
+      <w:r>
+        <w:t xml:space="preserve">. São Paulo: FBSP.</w:t>
       </w:r>
     </w:p>
     <w:p>
@@ -5796,7 +5770,16 @@
         <w:pStyle w:val="BodyText"/>
       </w:pPr>
       <w:r>
-        <w:t xml:space="preserve">RUFRANCOS, Hector</w:t>
+        <w:t xml:space="preserve">FÓRUM BRASILEIRO DE SEGURANÇA PÚBLICA (2024).</w:t>
+      </w:r>
+      <w:r>
+        <w:t xml:space="preserve"> </w:t>
+      </w:r>
+      <w:r>
+        <w:t xml:space="preserve">“Marcas de celulares mais roubadas no Brasil”</w:t>
+      </w:r>
+      <w:r>
+        <w:t xml:space="preserve">.</w:t>
       </w:r>
       <w:r>
         <w:t xml:space="preserve"> </w:t>
@@ -5806,22 +5789,38 @@
           <w:i/>
           <w:iCs/>
         </w:rPr>
-        <w:t xml:space="preserve">et al.</w:t>
-      </w:r>
-      <w:r>
-        <w:t xml:space="preserve"> </w:t>
-      </w:r>
-      <w:r>
-        <w:t xml:space="preserve">(2013).</w:t>
-      </w:r>
-      <w:r>
-        <w:t xml:space="preserve"> </w:t>
-      </w:r>
-      <w:r>
-        <w:t xml:space="preserve">“Income inequality and crime: a systematic review”</w:t>
-      </w:r>
-      <w:r>
-        <w:t xml:space="preserve">.</w:t>
+        <w:t xml:space="preserve">Anuário brasileiro de segurança pública</w:t>
+      </w:r>
+      <w:r>
+        <w:t xml:space="preserve"> </w:t>
+      </w:r>
+      <w:r>
+        <w:t xml:space="preserve">(via Exame/InfoMoney).</w:t>
+      </w:r>
+    </w:p>
+    <w:p>
+      <w:pPr>
+        <w:pStyle w:val="BodyText"/>
+      </w:pPr>
+      <w:r>
+        <w:t xml:space="preserve">FÓRUM BRASILEIRO DE SEGURANÇA PÚBLICA; DATAFOLHA (2026).</w:t>
+      </w:r>
+      <w:r>
+        <w:t xml:space="preserve"> </w:t>
+      </w:r>
+      <w:r>
+        <w:t xml:space="preserve">“Mudança de hábitos da população por insegurança”</w:t>
+      </w:r>
+      <w:r>
+        <w:t xml:space="preserve">. São Paulo: FBSP.</w:t>
+      </w:r>
+    </w:p>
+    <w:p>
+      <w:pPr>
+        <w:pStyle w:val="BodyText"/>
+      </w:pPr>
+      <w:r>
+        <w:t xml:space="preserve">FREES, E. (ed.) (2018).</w:t>
       </w:r>
       <w:r>
         <w:t xml:space="preserve"> </w:t>
@@ -5831,48 +5830,17 @@
           <w:i/>
           <w:iCs/>
         </w:rPr>
-        <w:t xml:space="preserve">Aggression and Violent Behavior</w:t>
-      </w:r>
-      <w:r>
-        <w:t xml:space="preserve">, v. 18, n. 2, p. 218–233.</w:t>
-      </w:r>
-    </w:p>
-    <w:p>
-      <w:pPr>
-        <w:pStyle w:val="BodyText"/>
-      </w:pPr>
-      <w:r>
-        <w:t xml:space="preserve">SANTOS, Marcelo Justus dos; KASSOUF, Ana Lúcia (2008).</w:t>
-      </w:r>
-      <w:r>
-        <w:t xml:space="preserve"> </w:t>
-      </w:r>
-      <w:r>
-        <w:t xml:space="preserve">“Estudos econômicos das causas da criminalidade no Brasil”</w:t>
-      </w:r>
-      <w:r>
-        <w:t xml:space="preserve">.</w:t>
-      </w:r>
-      <w:r>
-        <w:t xml:space="preserve"> </w:t>
+        <w:t xml:space="preserve">Loss Data Analytics</w:t>
+      </w:r>
+      <w:r>
+        <w:t xml:space="preserve">. International Actuarial Association; KLUGMAN, S. </w:t>
       </w:r>
       <w:r>
         <w:rPr>
           <w:i/>
           <w:iCs/>
         </w:rPr>
-        <w:t xml:space="preserve">EconomiA</w:t>
-      </w:r>
-      <w:r>
-        <w:t xml:space="preserve">, Brasília, v. 9, n. 2, p. 343–372.</w:t>
-      </w:r>
-    </w:p>
-    <w:p>
-      <w:pPr>
-        <w:pStyle w:val="BodyText"/>
-      </w:pPr>
-      <w:r>
-        <w:t xml:space="preserve">WORLD BANK (2011).</w:t>
+        <w:t xml:space="preserve">et al.</w:t>
       </w:r>
       <w:r>
         <w:t xml:space="preserve"> </w:t>
@@ -5882,256 +5850,39 @@
           <w:i/>
           <w:iCs/>
         </w:rPr>
-        <w:t xml:space="preserve">Crime and violence as development issues in Latin America and the Caribbean</w:t>
-      </w:r>
-      <w:r>
-        <w:t xml:space="preserve">. Washington, DC: World Bank.</w:t>
-      </w:r>
-    </w:p>
-    <w:bookmarkEnd w:id="44"/>
-    <w:bookmarkStart w:id="45" w:name="fontes-de-dados"/>
-    <w:p>
-      <w:pPr>
-        <w:pStyle w:val="Heading1"/>
-      </w:pPr>
-      <w:r>
-        <w:t xml:space="preserve">Fontes de dados</w:t>
-      </w:r>
-    </w:p>
-    <w:p>
-      <w:pPr>
-        <w:pStyle w:val="FirstParagraph"/>
-      </w:pPr>
-      <w:r>
-        <w:t xml:space="preserve">Preços coletados em 16/06/2026. Inventário (formato F-T.N) em</w:t>
-      </w:r>
-      <w:r>
-        <w:t xml:space="preserve"> </w:t>
-      </w:r>
-      <w:r>
-        <w:rPr>
-          <w:rStyle w:val="VerbatimChar"/>
-        </w:rPr>
-        <w:t xml:space="preserve">inventario_fontes.md</w:t>
-      </w:r>
-      <w:r>
-        <w:t xml:space="preserve">;</w:t>
-      </w:r>
-      <w:r>
-        <w:t xml:space="preserve"> </w:t>
-      </w:r>
-      <w:r>
-        <w:t xml:space="preserve">amostras de preço por modelo (com</w:t>
-      </w:r>
-      <w:r>
-        <w:t xml:space="preserve"> </w:t>
-      </w:r>
-      <m:oMath>
-        <m:r>
-          <m:t>n</m:t>
-        </m:r>
-      </m:oMath>
-      <w:r>
-        <w:t xml:space="preserve"> </w:t>
-      </w:r>
-      <w:r>
-        <w:t xml:space="preserve">e URL) em</w:t>
-      </w:r>
-      <w:r>
-        <w:t xml:space="preserve"> </w:t>
-      </w:r>
-      <w:r>
-        <w:rPr>
-          <w:rStyle w:val="VerbatimChar"/>
-        </w:rPr>
-        <w:t xml:space="preserve">dados_distribuicao.json</w:t>
+        <w:t xml:space="preserve">Loss Models: From Data to Decisions</w:t>
       </w:r>
       <w:r>
         <w:t xml:space="preserve">.</w:t>
       </w:r>
-      <w:r>
-        <w:t xml:space="preserve"> </w:t>
-      </w:r>
-      <w:r>
-        <w:t xml:space="preserve">(SEGUR/PREFEITURA DO RIO.</w:t>
-      </w:r>
-      <w:r>
-        <w:t xml:space="preserve"> </w:t>
-      </w:r>
-      <w:r>
-        <w:t xml:space="preserve">“Balanço de 100 dias da Força Municipal”</w:t>
-      </w:r>
-      <w:r>
-        <w:t xml:space="preserve"> </w:t>
-      </w:r>
-      <w:r>
-        <w:t xml:space="preserve">(slide oficial; itens recuperados e áreas de atuação), 2026) ·</w:t>
-      </w:r>
-      <w:r>
-        <w:t xml:space="preserve"> </w:t>
-      </w:r>
-      <w:r>
-        <w:t xml:space="preserve">(FÓRUM BRAS. DE SEGURANÇA PÚBLICA.</w:t>
-      </w:r>
-      <w:r>
-        <w:t xml:space="preserve"> </w:t>
-      </w:r>
-      <w:r>
-        <w:t xml:space="preserve">“Marcas de celulares mais roubadas”</w:t>
-      </w:r>
-      <w:r>
-        <w:t xml:space="preserve">, via Exame/InfoMoney, 2024) ·</w:t>
-      </w:r>
-      <w:r>
-        <w:t xml:space="preserve"> </w:t>
-      </w:r>
-      <w:r>
-        <w:t xml:space="preserve">(STATCOUNTER.</w:t>
-      </w:r>
-      <w:r>
-        <w:t xml:space="preserve"> </w:t>
-      </w:r>
-      <w:r>
-        <w:t xml:space="preserve">“Mobile Vendor Share Brazil”</w:t>
-      </w:r>
-      <w:r>
-        <w:t xml:space="preserve">, 2026) ·</w:t>
-      </w:r>
-      <w:r>
-        <w:t xml:space="preserve"> </w:t>
-      </w:r>
-      <w:r>
-        <w:t xml:space="preserve">(CETIC.BR.</w:t>
-      </w:r>
-      <w:r>
-        <w:t xml:space="preserve"> </w:t>
-      </w:r>
-      <w:r>
-        <w:t xml:space="preserve">“TIC Domicílios”</w:t>
-      </w:r>
-      <w:r>
-        <w:t xml:space="preserve">, 2024) ·</w:t>
-      </w:r>
-      <w:r>
-        <w:t xml:space="preserve"> </w:t>
-      </w:r>
-      <w:r>
-        <w:t xml:space="preserve">(TROCAFY/TROCAFONE.</w:t>
-      </w:r>
-      <w:r>
-        <w:t xml:space="preserve"> </w:t>
-      </w:r>
-      <w:r>
-        <w:t xml:space="preserve">“Seminovos por listagem”</w:t>
-      </w:r>
-      <w:r>
-        <w:t xml:space="preserve">, 2026) ·</w:t>
-      </w:r>
-      <w:r>
-        <w:t xml:space="preserve"> </w:t>
-      </w:r>
-      <w:r>
-        <w:t xml:space="preserve">(MAGAZINE LUIZA; SAMSUNG; APPLE.</w:t>
-      </w:r>
-      <w:r>
-        <w:t xml:space="preserve"> </w:t>
-      </w:r>
-      <w:r>
-        <w:t xml:space="preserve">“Preços de varejo (novo)”</w:t>
-      </w:r>
-      <w:r>
-        <w:t xml:space="preserve">, 2026) ·</w:t>
-      </w:r>
-      <w:r>
-        <w:t xml:space="preserve"> </w:t>
-      </w:r>
-      <w:r>
-        <w:t xml:space="preserve">(OLX.</w:t>
-      </w:r>
-      <w:r>
-        <w:t xml:space="preserve"> </w:t>
-      </w:r>
-      <w:r>
-        <w:t xml:space="preserve">“Celulares usados, RJ”</w:t>
-      </w:r>
-      <w:r>
-        <w:t xml:space="preserve">, 2024–2026) ·</w:t>
-      </w:r>
-      <w:r>
-        <w:t xml:space="preserve"> </w:t>
-      </w:r>
-      <w:r>
-        <w:t xml:space="preserve">(OURO RIO DE JANEIRO.</w:t>
-      </w:r>
-      <w:r>
-        <w:t xml:space="preserve"> </w:t>
-      </w:r>
-      <w:r>
-        <w:t xml:space="preserve">“Cotação do ouro 18k”</w:t>
-      </w:r>
-      <w:r>
-        <w:t xml:space="preserve">, 2026) ·</w:t>
-      </w:r>
-      <w:r>
-        <w:t xml:space="preserve"> </w:t>
-      </w:r>
-      <w:r>
-        <w:t xml:space="preserve">(SHEKINAH; PRATA PURA.</w:t>
-      </w:r>
-      <w:r>
-        <w:t xml:space="preserve"> </w:t>
-      </w:r>
-      <w:r>
-        <w:t xml:space="preserve">“Cordões folheados (preço)”</w:t>
-      </w:r>
-      <w:r>
-        <w:t xml:space="preserve">, 2026; DR JOIAS.</w:t>
-      </w:r>
-      <w:r>
-        <w:t xml:space="preserve"> </w:t>
-      </w:r>
-      <w:r>
-        <w:t xml:space="preserve">“Ouro 18k leve 1,8–8 g”</w:t>
-      </w:r>
-      <w:r>
-        <w:t xml:space="preserve">, 2026) ·</w:t>
-      </w:r>
-      <w:r>
-        <w:t xml:space="preserve"> </w:t>
-      </w:r>
-      <w:r>
-        <w:t xml:space="preserve">(SHAW, O. </w:t>
+    </w:p>
+    <w:p>
+      <w:pPr>
+        <w:pStyle w:val="BodyText"/>
+      </w:pPr>
+      <w:r>
+        <w:t xml:space="preserve">INSTITUTO BRASILEIRO DE GEOGRAFIA E ESTATÍSTICA (IBGE) (2022).</w:t>
+      </w:r>
+      <w:r>
+        <w:t xml:space="preserve"> </w:t>
       </w:r>
       <w:r>
         <w:rPr>
           <w:i/>
           <w:iCs/>
         </w:rPr>
-        <w:t xml:space="preserve">et al.</w:t>
-      </w:r>
-      <w:r>
-        <w:t xml:space="preserve"> </w:t>
-      </w:r>
-      <w:r>
-        <w:t xml:space="preserve">“Crime and the value of stolen goods”</w:t>
-      </w:r>
-      <w:r>
-        <w:t xml:space="preserve">, Home Office Research Report 81, 2015) ·</w:t>
-      </w:r>
-      <w:r>
-        <w:t xml:space="preserve"> </w:t>
-      </w:r>
-      <w:r>
-        <w:t xml:space="preserve">(FREES, E. (ed.).</w:t>
-      </w:r>
-      <w:r>
-        <w:t xml:space="preserve"> </w:t>
-      </w:r>
-      <w:r>
-        <w:t xml:space="preserve">“Loss Data Analytics”</w:t>
-      </w:r>
-      <w:r>
-        <w:t xml:space="preserve">, International Actuarial Association, 2018; KLUGMAN</w:t>
+        <w:t xml:space="preserve">Pesquisa Nacional por Amostra de Domicílios — Vitimização 2021</w:t>
+      </w:r>
+      <w:r>
+        <w:t xml:space="preserve">. Rio de Janeiro: IBGE.</w:t>
+      </w:r>
+    </w:p>
+    <w:p>
+      <w:pPr>
+        <w:pStyle w:val="BodyText"/>
+      </w:pPr>
+      <w:r>
+        <w:t xml:space="preserve">INSTITUTO DE PESQUISA ECONÔMICA APLICADA (IPEA); FÓRUM BRASILEIRO DE SEGURANÇA PÚBLICA.</w:t>
       </w:r>
       <w:r>
         <w:t xml:space="preserve"> </w:t>
@@ -6141,74 +5892,381 @@
           <w:i/>
           <w:iCs/>
         </w:rPr>
-        <w:t xml:space="preserve">et al.</w:t>
-      </w:r>
-      <w:r>
-        <w:t xml:space="preserve"> </w:t>
-      </w:r>
-      <w:r>
-        <w:t xml:space="preserve">“Loss Models”</w:t>
-      </w:r>
-      <w:r>
-        <w:t xml:space="preserve">) ·</w:t>
-      </w:r>
-      <w:r>
-        <w:t xml:space="preserve"> </w:t>
-      </w:r>
-      <w:r>
-        <w:t xml:space="preserve">(IBGE.</w:t>
-      </w:r>
-      <w:r>
-        <w:t xml:space="preserve"> </w:t>
-      </w:r>
-      <w:r>
-        <w:t xml:space="preserve">“PNAD Vitimização 2021”</w:t>
-      </w:r>
-      <w:r>
-        <w:t xml:space="preserve">, 2022; FBSP/DATAFOLHA.</w:t>
-      </w:r>
-      <w:r>
-        <w:t xml:space="preserve"> </w:t>
-      </w:r>
-      <w:r>
-        <w:t xml:space="preserve">“Mudança de hábitos por insegurança”</w:t>
-      </w:r>
-      <w:r>
-        <w:t xml:space="preserve">, 2026; EUROMONITOR.</w:t>
-      </w:r>
-      <w:r>
-        <w:t xml:space="preserve"> </w:t>
-      </w:r>
-      <w:r>
-        <w:t xml:space="preserve">“Jewellery in Brazil”</w:t>
-      </w:r>
-      <w:r>
-        <w:t xml:space="preserve">, 2025) ·</w:t>
-      </w:r>
-      <w:r>
-        <w:t xml:space="preserve"> </w:t>
-      </w:r>
-      <w:r>
-        <w:t xml:space="preserve">(ETULAIN, C. </w:t>
+        <w:t xml:space="preserve">Atlas da violência</w:t>
+      </w:r>
+      <w:r>
+        <w:t xml:space="preserve">. Brasília: IPEA; FBSP, várias edições.</w:t>
+      </w:r>
+    </w:p>
+    <w:p>
+      <w:pPr>
+        <w:pStyle w:val="BodyText"/>
+      </w:pPr>
+      <w:r>
+        <w:t xml:space="preserve">JAITMAN, Laura (ed.) (2017).</w:t>
+      </w:r>
+      <w:r>
+        <w:t xml:space="preserve"> </w:t>
       </w:r>
       <w:r>
         <w:rPr>
           <w:i/>
           <w:iCs/>
         </w:rPr>
+        <w:t xml:space="preserve">The costs of crime and violence: new evidence and insights in Latin America and the Caribbean</w:t>
+      </w:r>
+      <w:r>
+        <w:t xml:space="preserve">. Washington, DC: Inter-American Development Bank.</w:t>
+      </w:r>
+    </w:p>
+    <w:p>
+      <w:pPr>
+        <w:pStyle w:val="BodyText"/>
+      </w:pPr>
+      <w:r>
+        <w:t xml:space="preserve">MAGAZINE LUIZA; SAMSUNG; APPLE (2026).</w:t>
+      </w:r>
+      <w:r>
+        <w:t xml:space="preserve"> </w:t>
+      </w:r>
+      <w:r>
+        <w:rPr>
+          <w:i/>
+          <w:iCs/>
+        </w:rPr>
+        <w:t xml:space="preserve">Preços de varejo de celulares novos</w:t>
+      </w:r>
+      <w:r>
+        <w:t xml:space="preserve"> </w:t>
+      </w:r>
+      <w:r>
+        <w:t xml:space="preserve">(consulta a sítios oficiais).</w:t>
+      </w:r>
+    </w:p>
+    <w:p>
+      <w:pPr>
+        <w:pStyle w:val="BodyText"/>
+      </w:pPr>
+      <w:r>
+        <w:t xml:space="preserve">OLX BRASIL (2024–2026).</w:t>
+      </w:r>
+      <w:r>
+        <w:t xml:space="preserve"> </w:t>
+      </w:r>
+      <w:r>
+        <w:rPr>
+          <w:i/>
+          <w:iCs/>
+        </w:rPr>
+        <w:t xml:space="preserve">Anúncios de celulares usados — Rio de Janeiro</w:t>
+      </w:r>
+      <w:r>
+        <w:t xml:space="preserve">.</w:t>
+      </w:r>
+    </w:p>
+    <w:p>
+      <w:pPr>
+        <w:pStyle w:val="BodyText"/>
+      </w:pPr>
+      <w:r>
+        <w:t xml:space="preserve">OURO RIO DE JANEIRO (2026).</w:t>
+      </w:r>
+      <w:r>
+        <w:t xml:space="preserve"> </w:t>
+      </w:r>
+      <w:r>
+        <w:rPr>
+          <w:i/>
+          <w:iCs/>
+        </w:rPr>
+        <w:t xml:space="preserve">Cotação do ouro 18k</w:t>
+      </w:r>
+      <w:r>
+        <w:t xml:space="preserve">.</w:t>
+      </w:r>
+    </w:p>
+    <w:p>
+      <w:pPr>
+        <w:pStyle w:val="BodyText"/>
+      </w:pPr>
+      <w:r>
+        <w:t xml:space="preserve">PICKETT, Kate E.; WILKINSON, Richard G. (2015).</w:t>
+      </w:r>
+      <w:r>
+        <w:t xml:space="preserve"> </w:t>
+      </w:r>
+      <w:r>
+        <w:t xml:space="preserve">“Income inequality and health: a causal review”</w:t>
+      </w:r>
+      <w:r>
+        <w:t xml:space="preserve">.</w:t>
+      </w:r>
+      <w:r>
+        <w:t xml:space="preserve"> </w:t>
+      </w:r>
+      <w:r>
+        <w:rPr>
+          <w:i/>
+          <w:iCs/>
+        </w:rPr>
+        <w:t xml:space="preserve">Social Science &amp; Medicine</w:t>
+      </w:r>
+      <w:r>
+        <w:t xml:space="preserve">, v. 128, p. 316–326.</w:t>
+      </w:r>
+    </w:p>
+    <w:p>
+      <w:pPr>
+        <w:pStyle w:val="BodyText"/>
+      </w:pPr>
+      <w:r>
+        <w:t xml:space="preserve">PREFEITURA DO RIO — SECRETARIA ESPECIAL DE SEGURANÇA URBANA (SEGUR) (2026).</w:t>
+      </w:r>
+      <w:r>
+        <w:t xml:space="preserve"> </w:t>
+      </w:r>
+      <w:r>
+        <w:rPr>
+          <w:i/>
+          <w:iCs/>
+        </w:rPr>
+        <w:t xml:space="preserve">Balanço de 100 dias da Força Municipal</w:t>
+      </w:r>
+      <w:r>
+        <w:t xml:space="preserve"> </w:t>
+      </w:r>
+      <w:r>
+        <w:t xml:space="preserve">(slide oficial: itens recuperados e áreas de atuação).</w:t>
+      </w:r>
+    </w:p>
+    <w:p>
+      <w:pPr>
+        <w:pStyle w:val="BodyText"/>
+      </w:pPr>
+      <w:r>
+        <w:t xml:space="preserve">RESENDE, João Paulo de (2011).</w:t>
+      </w:r>
+      <w:r>
+        <w:t xml:space="preserve"> </w:t>
+      </w:r>
+      <w:r>
+        <w:t xml:space="preserve">“Desigualdade de renda e criminalidade”</w:t>
+      </w:r>
+      <w:r>
+        <w:t xml:space="preserve">.</w:t>
+      </w:r>
+      <w:r>
+        <w:t xml:space="preserve"> </w:t>
+      </w:r>
+      <w:r>
+        <w:rPr>
+          <w:i/>
+          <w:iCs/>
+        </w:rPr>
+        <w:t xml:space="preserve">Estudos Econômicos</w:t>
+      </w:r>
+      <w:r>
+        <w:t xml:space="preserve">, São Paulo, v. 41, n. 4, p. 731–753.</w:t>
+      </w:r>
+    </w:p>
+    <w:p>
+      <w:pPr>
+        <w:pStyle w:val="BodyText"/>
+      </w:pPr>
+      <w:r>
+        <w:t xml:space="preserve">RUFRANCOS, Hector</w:t>
+      </w:r>
+      <w:r>
+        <w:t xml:space="preserve"> </w:t>
+      </w:r>
+      <w:r>
+        <w:rPr>
+          <w:i/>
+          <w:iCs/>
+        </w:rPr>
         <w:t xml:space="preserve">et al.</w:t>
       </w:r>
       <w:r>
         <w:t xml:space="preserve"> </w:t>
       </w:r>
       <w:r>
-        <w:t xml:space="preserve">“Produção de semijoias em Limeira”</w:t>
-      </w:r>
-      <w:r>
-        <w:t xml:space="preserve">, UNICAMP, 2021; IBGM).</w:t>
-      </w:r>
-    </w:p>
-    <w:bookmarkEnd w:id="45"/>
+        <w:t xml:space="preserve">(2013).</w:t>
+      </w:r>
+      <w:r>
+        <w:t xml:space="preserve"> </w:t>
+      </w:r>
+      <w:r>
+        <w:t xml:space="preserve">“Income inequality and crime: a systematic review”</w:t>
+      </w:r>
+      <w:r>
+        <w:t xml:space="preserve">.</w:t>
+      </w:r>
+      <w:r>
+        <w:t xml:space="preserve"> </w:t>
+      </w:r>
+      <w:r>
+        <w:rPr>
+          <w:i/>
+          <w:iCs/>
+        </w:rPr>
+        <w:t xml:space="preserve">Aggression and Violent Behavior</w:t>
+      </w:r>
+      <w:r>
+        <w:t xml:space="preserve">, v. 18, n. 2, p. 218–233.</w:t>
+      </w:r>
+    </w:p>
+    <w:p>
+      <w:pPr>
+        <w:pStyle w:val="BodyText"/>
+      </w:pPr>
+      <w:r>
+        <w:t xml:space="preserve">SANTOS, Marcelo Justus dos; KASSOUF, Ana Lúcia (2008).</w:t>
+      </w:r>
+      <w:r>
+        <w:t xml:space="preserve"> </w:t>
+      </w:r>
+      <w:r>
+        <w:t xml:space="preserve">“Estudos econômicos das causas da criminalidade no Brasil”</w:t>
+      </w:r>
+      <w:r>
+        <w:t xml:space="preserve">.</w:t>
+      </w:r>
+      <w:r>
+        <w:t xml:space="preserve"> </w:t>
+      </w:r>
+      <w:r>
+        <w:rPr>
+          <w:i/>
+          <w:iCs/>
+        </w:rPr>
+        <w:t xml:space="preserve">EconomiA</w:t>
+      </w:r>
+      <w:r>
+        <w:t xml:space="preserve">, Brasília, v. 9, n. 2, p. 343–372.</w:t>
+      </w:r>
+    </w:p>
+    <w:p>
+      <w:pPr>
+        <w:pStyle w:val="BodyText"/>
+      </w:pPr>
+      <w:r>
+        <w:t xml:space="preserve">SHAW, O. </w:t>
+      </w:r>
+      <w:r>
+        <w:rPr>
+          <w:i/>
+          <w:iCs/>
+        </w:rPr>
+        <w:t xml:space="preserve">et al.</w:t>
+      </w:r>
+      <w:r>
+        <w:t xml:space="preserve"> </w:t>
+      </w:r>
+      <w:r>
+        <w:t xml:space="preserve">(2015).</w:t>
+      </w:r>
+      <w:r>
+        <w:t xml:space="preserve"> </w:t>
+      </w:r>
+      <w:r>
+        <w:rPr>
+          <w:i/>
+          <w:iCs/>
+        </w:rPr>
+        <w:t xml:space="preserve">Crime and the value of stolen goods</w:t>
+      </w:r>
+      <w:r>
+        <w:t xml:space="preserve">. Home Office Research Report 81. London: Home Office.</w:t>
+      </w:r>
+    </w:p>
+    <w:p>
+      <w:pPr>
+        <w:pStyle w:val="BodyText"/>
+      </w:pPr>
+      <w:r>
+        <w:t xml:space="preserve">SHEKINAH; PRATA PURA; DR JOIAS (2026).</w:t>
+      </w:r>
+      <w:r>
+        <w:t xml:space="preserve"> </w:t>
+      </w:r>
+      <w:r>
+        <w:rPr>
+          <w:i/>
+          <w:iCs/>
+        </w:rPr>
+        <w:t xml:space="preserve">Preços de cordões: folheados e ouro 18k leve (1,8–8 g)</w:t>
+      </w:r>
+      <w:r>
+        <w:t xml:space="preserve">.</w:t>
+      </w:r>
+    </w:p>
+    <w:p>
+      <w:pPr>
+        <w:pStyle w:val="BodyText"/>
+      </w:pPr>
+      <w:r>
+        <w:t xml:space="preserve">STATCOUNTER (2026).</w:t>
+      </w:r>
+      <w:r>
+        <w:t xml:space="preserve"> </w:t>
+      </w:r>
+      <w:r>
+        <w:rPr>
+          <w:i/>
+          <w:iCs/>
+        </w:rPr>
+        <w:t xml:space="preserve">Mobile Vendor Market Share — Brazil</w:t>
+      </w:r>
+      <w:r>
+        <w:t xml:space="preserve">.</w:t>
+      </w:r>
+    </w:p>
+    <w:p>
+      <w:pPr>
+        <w:pStyle w:val="BodyText"/>
+      </w:pPr>
+      <w:r>
+        <w:t xml:space="preserve">TROCAFY; TROCAFONE (2026).</w:t>
+      </w:r>
+      <w:r>
+        <w:t xml:space="preserve"> </w:t>
+      </w:r>
+      <w:r>
+        <w:rPr>
+          <w:i/>
+          <w:iCs/>
+        </w:rPr>
+        <w:t xml:space="preserve">Seminovos por listagem</w:t>
+      </w:r>
+      <w:r>
+        <w:t xml:space="preserve"> </w:t>
+      </w:r>
+      <w:r>
+        <w:t xml:space="preserve">(preços de celulares usados).</w:t>
+      </w:r>
+    </w:p>
+    <w:p>
+      <w:pPr>
+        <w:pStyle w:val="BodyText"/>
+      </w:pPr>
+      <w:r>
+        <w:t xml:space="preserve">WORLD BANK (2011).</w:t>
+      </w:r>
+      <w:r>
+        <w:t xml:space="preserve"> </w:t>
+      </w:r>
+      <w:r>
+        <w:rPr>
+          <w:i/>
+          <w:iCs/>
+        </w:rPr>
+        <w:t xml:space="preserve">Crime and violence as development issues in Latin America and the Caribbean</w:t>
+      </w:r>
+      <w:r>
+        <w:t xml:space="preserve">. Washington, DC: World Bank.</w:t>
+      </w:r>
+    </w:p>
+    <w:bookmarkEnd w:id="44"/>
     <w:sectPr>
       <w:footnotePr>
         <w:numRestart w:val="eachSect"/>

</xml_diff>

<commit_message>
Referências em ABNT NBR 6023: Disponível em / Acesso em nas fontes online
- Acrescenta URL (Disponível em:) e data (Acesso em: 16 jun. 2026; balanço
  SEGUR 24 jun. 2026) às 15 fontes consultadas online (OLX, Trocafy,
  StatCounter, CETIC, Magazine/Samsung/Apple, joalherias, Euromonitor, IBGE,
  IPEA/Atlas, FBSP, Frees, Shaw, SEGUR).
- Funde a cotação do ouro 18k na entrada das joalherias (remove item 'Ouro'
  sem URL). Refs impressas (livros/artigos) seguem sem URL, conforme a norma.
</commit_message>
<xml_diff>
--- a/paper/recuperacoes.docx
+++ b/paper/recuperacoes.docx
@@ -5482,7 +5482,7 @@
       </w:r>
     </w:p>
     <w:bookmarkEnd w:id="43"/>
-    <w:bookmarkStart w:id="44" w:name="referências"/>
+    <w:bookmarkStart w:id="61" w:name="referências"/>
     <w:p>
       <w:pPr>
         <w:pStyle w:val="Heading1"/>
@@ -5589,7 +5589,21 @@
         <w:t xml:space="preserve">TIC Domicílios</w:t>
       </w:r>
       <w:r>
-        <w:t xml:space="preserve">. São Paulo: Comitê Gestor da Internet no Brasil.</w:t>
+        <w:t xml:space="preserve">. São Paulo: Comitê Gestor da Internet no Brasil. Disponível em:</w:t>
+      </w:r>
+      <w:r>
+        <w:t xml:space="preserve"> </w:t>
+      </w:r>
+      <w:hyperlink r:id="rId44">
+        <w:r>
+          <w:rPr>
+            <w:rStyle w:val="Hyperlink"/>
+          </w:rPr>
+          <w:t xml:space="preserve">https://cetic.br/pt/pesquisa/domicilios/</w:t>
+        </w:r>
+      </w:hyperlink>
+      <w:r>
+        <w:t xml:space="preserve">. Acesso em: 16 jun. 2026.</w:t>
       </w:r>
     </w:p>
     <w:p>
@@ -5690,7 +5704,21 @@
         <w:t xml:space="preserve">Produção de semijoias em Limeira</w:t>
       </w:r>
       <w:r>
-        <w:t xml:space="preserve">. Campinas: UNICAMP; IBGM.</w:t>
+        <w:t xml:space="preserve">. Campinas: UNICAMP; IBGM. Disponível em:</w:t>
+      </w:r>
+      <w:r>
+        <w:t xml:space="preserve"> </w:t>
+      </w:r>
+      <w:hyperlink r:id="rId45">
+        <w:r>
+          <w:rPr>
+            <w:rStyle w:val="Hyperlink"/>
+          </w:rPr>
+          <w:t xml:space="preserve">https://econtents.bc.unicamp.br/omp/index.php/ebooks/catalog/book/150</w:t>
+        </w:r>
+      </w:hyperlink>
+      <w:r>
+        <w:t xml:space="preserve">. Acesso em: 16 jun. 2026.</w:t>
       </w:r>
     </w:p>
     <w:p>
@@ -5711,7 +5739,21 @@
         <w:t xml:space="preserve">Jewellery in Brazil</w:t>
       </w:r>
       <w:r>
-        <w:t xml:space="preserve">. London: Euromonitor.</w:t>
+        <w:t xml:space="preserve">. London: Euromonitor. Disponível em:</w:t>
+      </w:r>
+      <w:r>
+        <w:t xml:space="preserve"> </w:t>
+      </w:r>
+      <w:hyperlink r:id="rId46">
+        <w:r>
+          <w:rPr>
+            <w:rStyle w:val="Hyperlink"/>
+          </w:rPr>
+          <w:t xml:space="preserve">https://www.euromonitor.com/jewellery-in-brazil/report</w:t>
+        </w:r>
+      </w:hyperlink>
+      <w:r>
+        <w:t xml:space="preserve">. Acesso em: 16 jun. 2026.</w:t>
       </w:r>
     </w:p>
     <w:p>
@@ -5795,7 +5837,21 @@
         <w:t xml:space="preserve"> </w:t>
       </w:r>
       <w:r>
-        <w:t xml:space="preserve">(via Exame/InfoMoney).</w:t>
+        <w:t xml:space="preserve">(via Exame/InfoMoney). Disponível em:</w:t>
+      </w:r>
+      <w:r>
+        <w:t xml:space="preserve"> </w:t>
+      </w:r>
+      <w:hyperlink r:id="rId47">
+        <w:r>
+          <w:rPr>
+            <w:rStyle w:val="Hyperlink"/>
+          </w:rPr>
+          <w:t xml:space="preserve">https://exame.com/brasil/as-marcas-de-celulares-mais-roubadas-no-brasil-segundo-anuario-de-seguranca-publica/</w:t>
+        </w:r>
+      </w:hyperlink>
+      <w:r>
+        <w:t xml:space="preserve">. Acesso em: 16 jun. 2026.</w:t>
       </w:r>
     </w:p>
     <w:p>
@@ -5812,7 +5868,21 @@
         <w:t xml:space="preserve">“Mudança de hábitos da população por insegurança”</w:t>
       </w:r>
       <w:r>
-        <w:t xml:space="preserve">. São Paulo: FBSP.</w:t>
+        <w:t xml:space="preserve">. São Paulo: FBSP. Disponível em:</w:t>
+      </w:r>
+      <w:r>
+        <w:t xml:space="preserve"> </w:t>
+      </w:r>
+      <w:hyperlink r:id="rId48">
+        <w:r>
+          <w:rPr>
+            <w:rStyle w:val="Hyperlink"/>
+          </w:rPr>
+          <w:t xml:space="preserve">https://forumseguranca.org.br/</w:t>
+        </w:r>
+      </w:hyperlink>
+      <w:r>
+        <w:t xml:space="preserve">. Acesso em: 16 jun. 2026.</w:t>
       </w:r>
     </w:p>
     <w:p>
@@ -5853,7 +5923,21 @@
         <w:t xml:space="preserve">Loss Models: From Data to Decisions</w:t>
       </w:r>
       <w:r>
-        <w:t xml:space="preserve">.</w:t>
+        <w:t xml:space="preserve">. Disponível em:</w:t>
+      </w:r>
+      <w:r>
+        <w:t xml:space="preserve"> </w:t>
+      </w:r>
+      <w:hyperlink r:id="rId49">
+        <w:r>
+          <w:rPr>
+            <w:rStyle w:val="Hyperlink"/>
+          </w:rPr>
+          <w:t xml:space="preserve">https://openacttexts.github.io/Loss-Data-Analytics/</w:t>
+        </w:r>
+      </w:hyperlink>
+      <w:r>
+        <w:t xml:space="preserve">. Acesso em: 16 jun. 2026.</w:t>
       </w:r>
     </w:p>
     <w:p>
@@ -5874,7 +5958,21 @@
         <w:t xml:space="preserve">Pesquisa Nacional por Amostra de Domicílios — Vitimização 2021</w:t>
       </w:r>
       <w:r>
-        <w:t xml:space="preserve">. Rio de Janeiro: IBGE.</w:t>
+        <w:t xml:space="preserve">. Rio de Janeiro: IBGE. Disponível em:</w:t>
+      </w:r>
+      <w:r>
+        <w:t xml:space="preserve"> </w:t>
+      </w:r>
+      <w:hyperlink r:id="rId50">
+        <w:r>
+          <w:rPr>
+            <w:rStyle w:val="Hyperlink"/>
+          </w:rPr>
+          <w:t xml:space="preserve">https://agenciadenoticias.ibge.gov.br/</w:t>
+        </w:r>
+      </w:hyperlink>
+      <w:r>
+        <w:t xml:space="preserve">. Acesso em: 16 jun. 2026.</w:t>
       </w:r>
     </w:p>
     <w:p>
@@ -5895,7 +5993,21 @@
         <w:t xml:space="preserve">Atlas da violência</w:t>
       </w:r>
       <w:r>
-        <w:t xml:space="preserve">. Brasília: IPEA; FBSP, várias edições.</w:t>
+        <w:t xml:space="preserve">. Brasília: IPEA; FBSP, várias edições. Disponível em:</w:t>
+      </w:r>
+      <w:r>
+        <w:t xml:space="preserve"> </w:t>
+      </w:r>
+      <w:hyperlink r:id="rId51">
+        <w:r>
+          <w:rPr>
+            <w:rStyle w:val="Hyperlink"/>
+          </w:rPr>
+          <w:t xml:space="preserve">https://www.ipea.gov.br/atlasviolencia/</w:t>
+        </w:r>
+      </w:hyperlink>
+      <w:r>
+        <w:t xml:space="preserve">. Acesso em: 16 jun. 2026.</w:t>
       </w:r>
     </w:p>
     <w:p>
@@ -5937,10 +6049,49 @@
         <w:t xml:space="preserve">Preços de varejo de celulares novos</w:t>
       </w:r>
       <w:r>
-        <w:t xml:space="preserve"> </w:t>
-      </w:r>
-      <w:r>
-        <w:t xml:space="preserve">(consulta a sítios oficiais).</w:t>
+        <w:t xml:space="preserve">. Disponível em:</w:t>
+      </w:r>
+      <w:r>
+        <w:t xml:space="preserve"> </w:t>
+      </w:r>
+      <w:hyperlink r:id="rId52">
+        <w:r>
+          <w:rPr>
+            <w:rStyle w:val="Hyperlink"/>
+          </w:rPr>
+          <w:t xml:space="preserve">https://www.magazineluiza.com.br</w:t>
+        </w:r>
+      </w:hyperlink>
+      <w:r>
+        <w:t xml:space="preserve">;</w:t>
+      </w:r>
+      <w:r>
+        <w:t xml:space="preserve"> </w:t>
+      </w:r>
+      <w:hyperlink r:id="rId53">
+        <w:r>
+          <w:rPr>
+            <w:rStyle w:val="Hyperlink"/>
+          </w:rPr>
+          <w:t xml:space="preserve">https://www.samsung.com/br</w:t>
+        </w:r>
+      </w:hyperlink>
+      <w:r>
+        <w:t xml:space="preserve">;</w:t>
+      </w:r>
+      <w:r>
+        <w:t xml:space="preserve"> </w:t>
+      </w:r>
+      <w:hyperlink r:id="rId54">
+        <w:r>
+          <w:rPr>
+            <w:rStyle w:val="Hyperlink"/>
+          </w:rPr>
+          <w:t xml:space="preserve">https://www.apple.com/br</w:t>
+        </w:r>
+      </w:hyperlink>
+      <w:r>
+        <w:t xml:space="preserve">. Acesso em: 16 jun. 2026.</w:t>
       </w:r>
     </w:p>
     <w:p>
@@ -5961,15 +6112,38 @@
         <w:t xml:space="preserve">Anúncios de celulares usados — Rio de Janeiro</w:t>
       </w:r>
       <w:r>
+        <w:t xml:space="preserve">. Disponível em:</w:t>
+      </w:r>
+      <w:r>
+        <w:t xml:space="preserve"> </w:t>
+      </w:r>
+      <w:hyperlink r:id="rId55">
+        <w:r>
+          <w:rPr>
+            <w:rStyle w:val="Hyperlink"/>
+          </w:rPr>
+          <w:t xml:space="preserve">https://www.olx.com.br/celulares</w:t>
+        </w:r>
+      </w:hyperlink>
+      <w:r>
+        <w:t xml:space="preserve">. Acesso em: 16 jun. 2026.</w:t>
+      </w:r>
+    </w:p>
+    <w:p>
+      <w:pPr>
+        <w:pStyle w:val="BodyText"/>
+      </w:pPr>
+      <w:r>
+        <w:t xml:space="preserve">PICKETT, Kate E.; WILKINSON, Richard G. (2015).</w:t>
+      </w:r>
+      <w:r>
+        <w:t xml:space="preserve"> </w:t>
+      </w:r>
+      <w:r>
+        <w:t xml:space="preserve">“Income inequality and health: a causal review”</w:t>
+      </w:r>
+      <w:r>
         <w:t xml:space="preserve">.</w:t>
-      </w:r>
-    </w:p>
-    <w:p>
-      <w:pPr>
-        <w:pStyle w:val="BodyText"/>
-      </w:pPr>
-      <w:r>
-        <w:t xml:space="preserve">OURO RIO DE JANEIRO (2026).</w:t>
       </w:r>
       <w:r>
         <w:t xml:space="preserve"> </w:t>
@@ -5979,10 +6153,10 @@
           <w:i/>
           <w:iCs/>
         </w:rPr>
-        <w:t xml:space="preserve">Cotação do ouro 18k</w:t>
-      </w:r>
-      <w:r>
-        <w:t xml:space="preserve">.</w:t>
+        <w:t xml:space="preserve">Social Science &amp; Medicine</w:t>
+      </w:r>
+      <w:r>
+        <w:t xml:space="preserve">, v. 128, p. 316–326.</w:t>
       </w:r>
     </w:p>
     <w:p>
@@ -5990,16 +6164,7 @@
         <w:pStyle w:val="BodyText"/>
       </w:pPr>
       <w:r>
-        <w:t xml:space="preserve">PICKETT, Kate E.; WILKINSON, Richard G. (2015).</w:t>
-      </w:r>
-      <w:r>
-        <w:t xml:space="preserve"> </w:t>
-      </w:r>
-      <w:r>
-        <w:t xml:space="preserve">“Income inequality and health: a causal review”</w:t>
-      </w:r>
-      <w:r>
-        <w:t xml:space="preserve">.</w:t>
+        <w:t xml:space="preserve">PREFEITURA DO RIO — SECRETARIA ESPECIAL DE SEGURANÇA URBANA (SEGUR) (2026).</w:t>
       </w:r>
       <w:r>
         <w:t xml:space="preserve"> </w:t>
@@ -6009,10 +6174,27 @@
           <w:i/>
           <w:iCs/>
         </w:rPr>
-        <w:t xml:space="preserve">Social Science &amp; Medicine</w:t>
-      </w:r>
-      <w:r>
-        <w:t xml:space="preserve">, v. 128, p. 316–326.</w:t>
+        <w:t xml:space="preserve">Balanço de 100 dias da Força Municipal</w:t>
+      </w:r>
+      <w:r>
+        <w:t xml:space="preserve"> </w:t>
+      </w:r>
+      <w:r>
+        <w:t xml:space="preserve">(slide oficial: itens recuperados e áreas de atuação). Disponível em:</w:t>
+      </w:r>
+      <w:r>
+        <w:t xml:space="preserve"> </w:t>
+      </w:r>
+      <w:hyperlink r:id="rId20">
+        <w:r>
+          <w:rPr>
+            <w:rStyle w:val="Hyperlink"/>
+          </w:rPr>
+          <w:t xml:space="preserve">https://forcamunicipal.prefeitura.rio/</w:t>
+        </w:r>
+      </w:hyperlink>
+      <w:r>
+        <w:t xml:space="preserve">. Acesso em: 24 jun. 2026.</w:t>
       </w:r>
     </w:p>
     <w:p>
@@ -6020,7 +6202,16 @@
         <w:pStyle w:val="BodyText"/>
       </w:pPr>
       <w:r>
-        <w:t xml:space="preserve">PREFEITURA DO RIO — SECRETARIA ESPECIAL DE SEGURANÇA URBANA (SEGUR) (2026).</w:t>
+        <w:t xml:space="preserve">RESENDE, João Paulo de (2011).</w:t>
+      </w:r>
+      <w:r>
+        <w:t xml:space="preserve"> </w:t>
+      </w:r>
+      <w:r>
+        <w:t xml:space="preserve">“Desigualdade de renda e criminalidade”</w:t>
+      </w:r>
+      <w:r>
+        <w:t xml:space="preserve">.</w:t>
       </w:r>
       <w:r>
         <w:t xml:space="preserve"> </w:t>
@@ -6030,13 +6221,10 @@
           <w:i/>
           <w:iCs/>
         </w:rPr>
-        <w:t xml:space="preserve">Balanço de 100 dias da Força Municipal</w:t>
-      </w:r>
-      <w:r>
-        <w:t xml:space="preserve"> </w:t>
-      </w:r>
-      <w:r>
-        <w:t xml:space="preserve">(slide oficial: itens recuperados e áreas de atuação).</w:t>
+        <w:t xml:space="preserve">Estudos Econômicos</w:t>
+      </w:r>
+      <w:r>
+        <w:t xml:space="preserve">, São Paulo, v. 41, n. 4, p. 731–753.</w:t>
       </w:r>
     </w:p>
     <w:p>
@@ -6044,16 +6232,7 @@
         <w:pStyle w:val="BodyText"/>
       </w:pPr>
       <w:r>
-        <w:t xml:space="preserve">RESENDE, João Paulo de (2011).</w:t>
-      </w:r>
-      <w:r>
-        <w:t xml:space="preserve"> </w:t>
-      </w:r>
-      <w:r>
-        <w:t xml:space="preserve">“Desigualdade de renda e criminalidade”</w:t>
-      </w:r>
-      <w:r>
-        <w:t xml:space="preserve">.</w:t>
+        <w:t xml:space="preserve">RUFRANCOS, Hector</w:t>
       </w:r>
       <w:r>
         <w:t xml:space="preserve"> </w:t>
@@ -6063,18 +6242,22 @@
           <w:i/>
           <w:iCs/>
         </w:rPr>
-        <w:t xml:space="preserve">Estudos Econômicos</w:t>
-      </w:r>
-      <w:r>
-        <w:t xml:space="preserve">, São Paulo, v. 41, n. 4, p. 731–753.</w:t>
-      </w:r>
-    </w:p>
-    <w:p>
-      <w:pPr>
-        <w:pStyle w:val="BodyText"/>
-      </w:pPr>
-      <w:r>
-        <w:t xml:space="preserve">RUFRANCOS, Hector</w:t>
+        <w:t xml:space="preserve">et al.</w:t>
+      </w:r>
+      <w:r>
+        <w:t xml:space="preserve"> </w:t>
+      </w:r>
+      <w:r>
+        <w:t xml:space="preserve">(2013).</w:t>
+      </w:r>
+      <w:r>
+        <w:t xml:space="preserve"> </w:t>
+      </w:r>
+      <w:r>
+        <w:t xml:space="preserve">“Income inequality and crime: a systematic review”</w:t>
+      </w:r>
+      <w:r>
+        <w:t xml:space="preserve">.</w:t>
       </w:r>
       <w:r>
         <w:t xml:space="preserve"> </w:t>
@@ -6084,19 +6267,24 @@
           <w:i/>
           <w:iCs/>
         </w:rPr>
-        <w:t xml:space="preserve">et al.</w:t>
-      </w:r>
-      <w:r>
-        <w:t xml:space="preserve"> </w:t>
-      </w:r>
-      <w:r>
-        <w:t xml:space="preserve">(2013).</w:t>
-      </w:r>
-      <w:r>
-        <w:t xml:space="preserve"> </w:t>
-      </w:r>
-      <w:r>
-        <w:t xml:space="preserve">“Income inequality and crime: a systematic review”</w:t>
+        <w:t xml:space="preserve">Aggression and Violent Behavior</w:t>
+      </w:r>
+      <w:r>
+        <w:t xml:space="preserve">, v. 18, n. 2, p. 218–233.</w:t>
+      </w:r>
+    </w:p>
+    <w:p>
+      <w:pPr>
+        <w:pStyle w:val="BodyText"/>
+      </w:pPr>
+      <w:r>
+        <w:t xml:space="preserve">SANTOS, Marcelo Justus dos; KASSOUF, Ana Lúcia (2008).</w:t>
+      </w:r>
+      <w:r>
+        <w:t xml:space="preserve"> </w:t>
+      </w:r>
+      <w:r>
+        <w:t xml:space="preserve">“Estudos econômicos das causas da criminalidade no Brasil”</w:t>
       </w:r>
       <w:r>
         <w:t xml:space="preserve">.</w:t>
@@ -6109,10 +6297,10 @@
           <w:i/>
           <w:iCs/>
         </w:rPr>
-        <w:t xml:space="preserve">Aggression and Violent Behavior</w:t>
-      </w:r>
-      <w:r>
-        <w:t xml:space="preserve">, v. 18, n. 2, p. 218–233.</w:t>
+        <w:t xml:space="preserve">EconomiA</w:t>
+      </w:r>
+      <w:r>
+        <w:t xml:space="preserve">, Brasília, v. 9, n. 2, p. 343–372.</w:t>
       </w:r>
     </w:p>
     <w:p>
@@ -6120,50 +6308,55 @@
         <w:pStyle w:val="BodyText"/>
       </w:pPr>
       <w:r>
-        <w:t xml:space="preserve">SANTOS, Marcelo Justus dos; KASSOUF, Ana Lúcia (2008).</w:t>
-      </w:r>
-      <w:r>
-        <w:t xml:space="preserve"> </w:t>
-      </w:r>
-      <w:r>
-        <w:t xml:space="preserve">“Estudos econômicos das causas da criminalidade no Brasil”</w:t>
-      </w:r>
-      <w:r>
-        <w:t xml:space="preserve">.</w:t>
-      </w:r>
-      <w:r>
-        <w:t xml:space="preserve"> </w:t>
+        <w:t xml:space="preserve">SHAW, O. </w:t>
       </w:r>
       <w:r>
         <w:rPr>
           <w:i/>
           <w:iCs/>
         </w:rPr>
-        <w:t xml:space="preserve">EconomiA</w:t>
-      </w:r>
-      <w:r>
-        <w:t xml:space="preserve">, Brasília, v. 9, n. 2, p. 343–372.</w:t>
-      </w:r>
-    </w:p>
-    <w:p>
-      <w:pPr>
-        <w:pStyle w:val="BodyText"/>
-      </w:pPr>
-      <w:r>
-        <w:t xml:space="preserve">SHAW, O. </w:t>
+        <w:t xml:space="preserve">et al.</w:t>
+      </w:r>
+      <w:r>
+        <w:t xml:space="preserve"> </w:t>
+      </w:r>
+      <w:r>
+        <w:t xml:space="preserve">(2015).</w:t>
+      </w:r>
+      <w:r>
+        <w:t xml:space="preserve"> </w:t>
       </w:r>
       <w:r>
         <w:rPr>
           <w:i/>
           <w:iCs/>
         </w:rPr>
-        <w:t xml:space="preserve">et al.</w:t>
-      </w:r>
-      <w:r>
-        <w:t xml:space="preserve"> </w:t>
-      </w:r>
-      <w:r>
-        <w:t xml:space="preserve">(2015).</w:t>
+        <w:t xml:space="preserve">Crime and the value of stolen goods</w:t>
+      </w:r>
+      <w:r>
+        <w:t xml:space="preserve">. Home Office Research Report 81. London: Home Office. Disponível em:</w:t>
+      </w:r>
+      <w:r>
+        <w:t xml:space="preserve"> </w:t>
+      </w:r>
+      <w:hyperlink r:id="rId56">
+        <w:r>
+          <w:rPr>
+            <w:rStyle w:val="Hyperlink"/>
+          </w:rPr>
+          <w:t xml:space="preserve">https://assets.publishing.service.gov.uk/media/5a7f3886ed915d74e33f5149/horr81.pdf</w:t>
+        </w:r>
+      </w:hyperlink>
+      <w:r>
+        <w:t xml:space="preserve">. Acesso em: 16 jun. 2026.</w:t>
+      </w:r>
+    </w:p>
+    <w:p>
+      <w:pPr>
+        <w:pStyle w:val="BodyText"/>
+      </w:pPr>
+      <w:r>
+        <w:t xml:space="preserve">SHEKINAH; PRATA PURA; DR JOIAS (2026).</w:t>
       </w:r>
       <w:r>
         <w:t xml:space="preserve"> </w:t>
@@ -6173,10 +6366,24 @@
           <w:i/>
           <w:iCs/>
         </w:rPr>
-        <w:t xml:space="preserve">Crime and the value of stolen goods</w:t>
-      </w:r>
-      <w:r>
-        <w:t xml:space="preserve">. Home Office Research Report 81. London: Home Office.</w:t>
+        <w:t xml:space="preserve">Preços de cordões: folheados e ouro 18k leve (1,8–8 g); cotação do ouro 18k</w:t>
+      </w:r>
+      <w:r>
+        <w:t xml:space="preserve">. Disponível em:</w:t>
+      </w:r>
+      <w:r>
+        <w:t xml:space="preserve"> </w:t>
+      </w:r>
+      <w:hyperlink r:id="rId57">
+        <w:r>
+          <w:rPr>
+            <w:rStyle w:val="Hyperlink"/>
+          </w:rPr>
+          <w:t xml:space="preserve">https://www.pratapurajoias.com.br/folheado-a-ouro-18k/correntes-lisas-folheadas-a-ouro-18k</w:t>
+        </w:r>
+      </w:hyperlink>
+      <w:r>
+        <w:t xml:space="preserve">. Acesso em: 16 jun. 2026.</w:t>
       </w:r>
     </w:p>
     <w:p>
@@ -6184,7 +6391,7 @@
         <w:pStyle w:val="BodyText"/>
       </w:pPr>
       <w:r>
-        <w:t xml:space="preserve">SHEKINAH; PRATA PURA; DR JOIAS (2026).</w:t>
+        <w:t xml:space="preserve">STATCOUNTER (2026).</w:t>
       </w:r>
       <w:r>
         <w:t xml:space="preserve"> </w:t>
@@ -6194,10 +6401,24 @@
           <w:i/>
           <w:iCs/>
         </w:rPr>
-        <w:t xml:space="preserve">Preços de cordões: folheados e ouro 18k leve (1,8–8 g)</w:t>
-      </w:r>
-      <w:r>
-        <w:t xml:space="preserve">.</w:t>
+        <w:t xml:space="preserve">Mobile Vendor Market Share — Brazil</w:t>
+      </w:r>
+      <w:r>
+        <w:t xml:space="preserve">. Disponível em:</w:t>
+      </w:r>
+      <w:r>
+        <w:t xml:space="preserve"> </w:t>
+      </w:r>
+      <w:hyperlink r:id="rId58">
+        <w:r>
+          <w:rPr>
+            <w:rStyle w:val="Hyperlink"/>
+          </w:rPr>
+          <w:t xml:space="preserve">https://gs.statcounter.com/vendor-market-share/mobile/brazil</w:t>
+        </w:r>
+      </w:hyperlink>
+      <w:r>
+        <w:t xml:space="preserve">. Acesso em: 16 jun. 2026.</w:t>
       </w:r>
     </w:p>
     <w:p>
@@ -6205,7 +6426,7 @@
         <w:pStyle w:val="BodyText"/>
       </w:pPr>
       <w:r>
-        <w:t xml:space="preserve">STATCOUNTER (2026).</w:t>
+        <w:t xml:space="preserve">TROCAFY; TROCAFONE (2026).</w:t>
       </w:r>
       <w:r>
         <w:t xml:space="preserve"> </w:t>
@@ -6215,10 +6436,41 @@
           <w:i/>
           <w:iCs/>
         </w:rPr>
-        <w:t xml:space="preserve">Mobile Vendor Market Share — Brazil</w:t>
-      </w:r>
-      <w:r>
-        <w:t xml:space="preserve">.</w:t>
+        <w:t xml:space="preserve">Seminovos por listagem</w:t>
+      </w:r>
+      <w:r>
+        <w:t xml:space="preserve"> </w:t>
+      </w:r>
+      <w:r>
+        <w:t xml:space="preserve">(preços de celulares usados). Disponível em:</w:t>
+      </w:r>
+      <w:r>
+        <w:t xml:space="preserve"> </w:t>
+      </w:r>
+      <w:hyperlink r:id="rId59">
+        <w:r>
+          <w:rPr>
+            <w:rStyle w:val="Hyperlink"/>
+          </w:rPr>
+          <w:t xml:space="preserve">https://www.trocafy.com.br</w:t>
+        </w:r>
+      </w:hyperlink>
+      <w:r>
+        <w:t xml:space="preserve">;</w:t>
+      </w:r>
+      <w:r>
+        <w:t xml:space="preserve"> </w:t>
+      </w:r>
+      <w:hyperlink r:id="rId60">
+        <w:r>
+          <w:rPr>
+            <w:rStyle w:val="Hyperlink"/>
+          </w:rPr>
+          <w:t xml:space="preserve">https://www.trocafone.com.br</w:t>
+        </w:r>
+      </w:hyperlink>
+      <w:r>
+        <w:t xml:space="preserve">. Acesso em: 16 jun. 2026.</w:t>
       </w:r>
     </w:p>
     <w:p>
@@ -6226,7 +6478,7 @@
         <w:pStyle w:val="BodyText"/>
       </w:pPr>
       <w:r>
-        <w:t xml:space="preserve">TROCAFY; TROCAFONE (2026).</w:t>
+        <w:t xml:space="preserve">WORLD BANK (2011).</w:t>
       </w:r>
       <w:r>
         <w:t xml:space="preserve"> </w:t>
@@ -6236,37 +6488,13 @@
           <w:i/>
           <w:iCs/>
         </w:rPr>
-        <w:t xml:space="preserve">Seminovos por listagem</w:t>
-      </w:r>
-      <w:r>
-        <w:t xml:space="preserve"> </w:t>
-      </w:r>
-      <w:r>
-        <w:t xml:space="preserve">(preços de celulares usados).</w:t>
-      </w:r>
-    </w:p>
-    <w:p>
-      <w:pPr>
-        <w:pStyle w:val="BodyText"/>
-      </w:pPr>
-      <w:r>
-        <w:t xml:space="preserve">WORLD BANK (2011).</w:t>
-      </w:r>
-      <w:r>
-        <w:t xml:space="preserve"> </w:t>
-      </w:r>
-      <w:r>
-        <w:rPr>
-          <w:i/>
-          <w:iCs/>
-        </w:rPr>
         <w:t xml:space="preserve">Crime and violence as development issues in Latin America and the Caribbean</w:t>
       </w:r>
       <w:r>
         <w:t xml:space="preserve">. Washington, DC: World Bank.</w:t>
       </w:r>
     </w:p>
-    <w:bookmarkEnd w:id="44"/>
+    <w:bookmarkEnd w:id="61"/>
     <w:sectPr>
       <w:footnotePr>
         <w:numRestart w:val="eachSect"/>

</xml_diff>